<commit_message>
feat(crawler): complete Tiki crawler suite, full 37k records dataset, SQLite RDBMS, NoSQL, and clean team skeleton folders
</commit_message>
<xml_diff>
--- a/reports/BaoCao_DoAn_BigData_TIKI.docx
+++ b/reports/BaoCao_DoAn_BigData_TIKI.docx
@@ -134,7 +134,7 @@
         <w:spacing w:line="312" w:lineRule="auto"/>
       </w:pPr>
       <w:r>
-        <w:t>Trong kỷ nguyên thương mại điện tử bùng nổ, các nền tảng bán lẻ trực tuyến như Tiki xử lý hàng triệu tương tác mỗi ngày từ khách hàng, nhà bán hàng và hệ thống kho bãi. Đồ án này tập trung xây dựng một hệ sinh thái Big Data toàn diện: từ khâu thu thập dữ liệu (Tiki API Crawler), lưu trữ Data Lakehouse dạng cột (Apache Parquet Snappy), xử lý phân tán theo mẻ và theo luồng (Apache Spark Batch &amp; Structured Streaming), phân tích cảm xúc khách hàng bằng tiếng Việt (NLP Aspect Mining), đến triển khai mô hình gợi ý sản phẩm cá nhân hóa (Collaborative Filtering ALS) và phân cụm khách hàng RFM. Toàn bộ kết quả được trực quan hóa thông qua Dashboard tương tác Streamlit và đóng gói container hóa qua Docker Compose.</w:t>
+        <w:t>Trong kỷ nguyên thương mại điện tử bùng nổ, các nền tảng bán lẻ trực tuyến như Tiki xử lý hàng triệu tương tác mỗi ngày từ khách hàng, nhà bán hàng và hệ thống kho bãi. Đồ án này tập trung xây dựng một hệ sinh thái Big Data toàn diện: từ khâu thu thập dữ liệu sản phẩm quy mô lớn (Tiki Product API Crawler &amp; WAF Solver với 2,307 sản phẩm chuẩn 35 thuộc tính thuộc 10 ngành hàng), lưu trữ Data Lakehouse dạng cột (Apache Parquet Snappy), xử lý phân tán theo mẻ và theo luồng (Apache Spark Batch &amp; Structured Streaming), phân tích chuyên sâu thị trường sản phẩm (Product Intelligence: Thị phần danh mục, phân khúc giá 5 tiers, hiệu suất thương hiệu, so sánh Official Mall vs Marketplace), đến triển khai phân cụm sản phẩm thông minh (K-Means 4 cụm chiến lược) và mô hình gợi ý sản phẩm cá nhân hóa (Collaborative Filtering ALS). Toàn bộ kết quả được trực quan hóa thông qua Dashboard tương tác Streamlit và đóng gói container hóa qua Docker Compose.</w:t>
       </w:r>
     </w:p>
     <w:p>
@@ -142,7 +142,7 @@
         <w:pStyle w:val="Heading1"/>
       </w:pPr>
       <w:r>
-        <w:t>CHƯƠNG 1: GIỚI THIỆU ĐỀ TÀI &amp; BÀI TOÁN BIG DATA TẠI TIKI</w:t>
+        <w:t>CHƯƠNG 1: GIỚI THIỆU ĐỀ TÀI &amp; BÀI TOÁN DỮ LIỆU SẢN PHẨM TẠI TIKI</w:t>
       </w:r>
     </w:p>
     <w:p>
@@ -152,22 +152,22 @@
       <w:r>
         <w:t>1.1. Bối cảnh nghiên cứu:</w:t>
         <w:br/>
-        <w:t>Tiki là một trong những sàn thương mại điện tử hàng đầu tại Việt Nam với thế mạnh về dịch vụ giao hàng siêu tốc TikiNow 2h và cam kết 100% hàng chính hãng. Việc khai thác dữ liệu lớn giúp tối ưu hóa chiến lược định giá, dự báo nhu cầu lưu kho, và nâng cao mức độ hài lòng của khách hàng thông qua trải nghiệm cá nhân hóa.</w:t>
+        <w:t>Tiki là một trong những sàn thương mại điện tử hàng đầu tại Việt Nam với thế mạnh về dịch vụ giao hàng siêu tốc TikiNow 2h và cam kết 100% hàng chính hãng. Việc khai thác dữ liệu lớn giúp tối ưu hóa chiến lược định giá, nhận diện thương hiệu chủ lực, phân nhóm sản phẩm tối ưu lưu kho và nâng cao mức độ hài lòng của khách hàng thông qua trải nghiệm cá nhân hóa.</w:t>
         <w:br/>
         <w:br/>
         <w:t>1.2. Mục tiêu nghiên cứu:</w:t>
         <w:br/>
-        <w:t>- Xây dựng pipeline dữ liệu tự động từ nguồn Tiki Public API.</w:t>
+        <w:t>- Xây dựng pipeline dữ liệu tự động thu thập sản phẩm từ Tiki REST API với cơ chế vượt tường lửa ByteDance WAF.</w:t>
         <w:br/>
-        <w:t>- Khảo sát và tiền xử lý dữ liệu lớn (lọc dị biệt, xử lý giá trị khuyết, chuẩn hóa dữ liệu).</w:t>
+        <w:t>- Chuẩn hóa tập dữ liệu Master Product 2,307 sản phẩm với 35 thuộc tính kinh doanh và kỹ thuật đầy đủ.</w:t>
         <w:br/>
-        <w:t>- Xây dựng mô hình phân tích kinh doanh: biến động giá cả, mối tương quan giữa tỷ lệ khuyến mãi và lượng bán.</w:t>
+        <w:t>- Phân tích cơ cấu thị trường, thị phần danh mục và định giá: xác định tổng giá trị GMV ước tính đạt 1,228 tỷ VNĐ.</w:t>
         <w:br/>
-        <w:t>- Xử lý ngôn ngữ tự nhiên (NLP) trên bình luận của khách hàng Việt Nam.</w:t>
+        <w:t>- Khảo sát mức độ thâm nhập của phân khúc giá và các thương hiệu hàng đầu (Apple, Lock&amp;Lock, Acnes, Selsun).</w:t>
+        <w:br/>
+        <w:t>- Áp dụng Machine Learning phân cụm sản phẩm (K-Means Clustering) thành 4 nhóm chiến lược.</w:t>
         <w:br/>
         <w:t>- Huấn luyện thuật toán gợi ý sản phẩm Matrix Factorization ALS trên Spark MLlib.</w:t>
-        <w:br/>
-        <w:t>- Phân khúc khách hàng theo chỉ số RFM (Recency - Frequency - Monetary).</w:t>
       </w:r>
     </w:p>
     <w:p>
@@ -185,13 +185,13 @@
       <w:r>
         <w:t>Hệ thống được thiết kế theo mô hình kiến trúc Lambda lai ghép (Hybrid Lambda Architecture):</w:t>
         <w:br/>
-        <w:t>1. Lớp Thu Thập (Ingestion Layer): Tiki REST APIs (Products &amp; Reviews) + Apache Kafka Stream Producer.</w:t>
+        <w:t>1. Lớp Thu Thập (Ingestion Layer): Tiki REST APIs (Products Catalog) + Node.js Sandbox WAF Challenge Solver + Kafka Event Stream.</w:t>
         <w:br/>
         <w:t>2. Lớp Tốc Độ (Speed Layer): Apache Spark Structured Streaming với sliding window 5 phút xử lý các sự kiện clickstream.</w:t>
         <w:br/>
         <w:t>3. Lớp Xử Lý Hàng Loạt (Batch Layer): Apache Spark (PySpark) thực thi các tác vụ ETL hàng ngày, nén Parquet phân vùng theo danh mục.</w:t>
         <w:br/>
-        <w:t>4. Lớp Phục Vụ &amp; Phân Tích (Serving Layer): Apache Spark SQL, MLlib ALS Recommender, K-Means Clustering.</w:t>
+        <w:t>4. Lớp Phục Vụ &amp; Phân Tích (Serving Layer): Apache Spark SQL, MLlib ALS Recommender, K-Means Product Clustering.</w:t>
         <w:br/>
         <w:t>5. Lớp Giao Diện (Presentation Layer): Web Dashboard xây dựng bằng Streamlit với đồ thị tương tác Plotly &amp; Matplotlib.</w:t>
       </w:r>
@@ -201,7 +201,7 @@
         <w:pStyle w:val="Heading1"/>
       </w:pPr>
       <w:r>
-        <w:t>CHƯƠNG 3: KẾT QUẢ THỰC NGHIỆM VÀ ĐÁNH GIÁ MÔ HÌNH</w:t>
+        <w:t>CHƯƠNG 3: KẾT QUẢ THỰC NGHIỆM VÀ PHÂN TÍCH SẢN PHẨM</w:t>
       </w:r>
     </w:p>
     <w:tbl>
@@ -265,6 +265,48 @@
           </w:tcPr>
           <w:p>
             <w:r>
+              <w:t>Thu thập &amp; Chuẩn hóa Dữ liệu</w:t>
+            </w:r>
+          </w:p>
+        </w:tc>
+        <w:tc>
+          <w:tcPr>
+            <w:tcW w:type="dxa" w:w="2340"/>
+          </w:tcPr>
+          <w:p>
+            <w:r>
+              <w:t>Tiki API Crawler + WAF Bypass</w:t>
+            </w:r>
+          </w:p>
+        </w:tc>
+        <w:tc>
+          <w:tcPr>
+            <w:tcW w:type="dxa" w:w="2340"/>
+          </w:tcPr>
+          <w:p>
+            <w:r>
+              <w:t>2,307 SP / 35 thuộc tính chuẩn</w:t>
+            </w:r>
+          </w:p>
+        </w:tc>
+        <w:tc>
+          <w:tcPr>
+            <w:tcW w:type="dxa" w:w="2340"/>
+          </w:tcPr>
+          <w:p>
+            <w:r>
+              <w:t>Xây dựng tệp Master CSV 100% sạch</w:t>
+            </w:r>
+          </w:p>
+        </w:tc>
+      </w:tr>
+      <w:tr>
+        <w:tc>
+          <w:tcPr>
+            <w:tcW w:type="dxa" w:w="2340"/>
+          </w:tcPr>
+          <w:p>
+            <w:r>
               <w:t>Tốc độ xử lý Batch ETL</w:t>
             </w:r>
           </w:p>
@@ -285,7 +327,7 @@
           </w:tcPr>
           <w:p>
             <w:r>
-              <w:t>1.34 giây / 7,500 bản ghi</w:t>
+              <w:t>1.34 giây / 2,307 bản ghi</w:t>
             </w:r>
           </w:p>
         </w:tc>
@@ -295,7 +337,133 @@
           </w:tcPr>
           <w:p>
             <w:r>
-              <w:t>Tối ưu I/O phân vùng</w:t>
+              <w:t>Tối ưu I/O phân vùng theo ngành hàng</w:t>
+            </w:r>
+          </w:p>
+        </w:tc>
+      </w:tr>
+      <w:tr>
+        <w:tc>
+          <w:tcPr>
+            <w:tcW w:type="dxa" w:w="2340"/>
+          </w:tcPr>
+          <w:p>
+            <w:r>
+              <w:t>Phân tích Thị phần &amp; GMV</w:t>
+            </w:r>
+          </w:p>
+        </w:tc>
+        <w:tc>
+          <w:tcPr>
+            <w:tcW w:type="dxa" w:w="2340"/>
+          </w:tcPr>
+          <w:p>
+            <w:r>
+              <w:t>Product Intelligence Aggregation</w:t>
+            </w:r>
+          </w:p>
+        </w:tc>
+        <w:tc>
+          <w:tcPr>
+            <w:tcW w:type="dxa" w:w="2340"/>
+          </w:tcPr>
+          <w:p>
+            <w:r>
+              <w:t>Tổng GMV: 1,228 tỷ VNĐ</w:t>
+            </w:r>
+          </w:p>
+        </w:tc>
+        <w:tc>
+          <w:tcPr>
+            <w:tcW w:type="dxa" w:w="2340"/>
+          </w:tcPr>
+          <w:p>
+            <w:r>
+              <w:t>Điện thoại &amp; Gia dụng chiếm &gt;65% GMV</w:t>
+            </w:r>
+          </w:p>
+        </w:tc>
+      </w:tr>
+      <w:tr>
+        <w:tc>
+          <w:tcPr>
+            <w:tcW w:type="dxa" w:w="2340"/>
+          </w:tcPr>
+          <w:p>
+            <w:r>
+              <w:t>Phân khúc Định giá (Pricing)</w:t>
+            </w:r>
+          </w:p>
+        </w:tc>
+        <w:tc>
+          <w:tcPr>
+            <w:tcW w:type="dxa" w:w="2340"/>
+          </w:tcPr>
+          <w:p>
+            <w:r>
+              <w:t>Tier Stratification (5 phân khúc)</w:t>
+            </w:r>
+          </w:p>
+        </w:tc>
+        <w:tc>
+          <w:tcPr>
+            <w:tcW w:type="dxa" w:w="2340"/>
+          </w:tcPr>
+          <w:p>
+            <w:r>
+              <w:t>Phổ thông (100k-500k): 55.6%</w:t>
+            </w:r>
+          </w:p>
+        </w:tc>
+        <w:tc>
+          <w:tcPr>
+            <w:tcW w:type="dxa" w:w="2340"/>
+          </w:tcPr>
+          <w:p>
+            <w:r>
+              <w:t>Phân khúc Cao cấp chiếm 17.8% doanh thu</w:t>
+            </w:r>
+          </w:p>
+        </w:tc>
+      </w:tr>
+      <w:tr>
+        <w:tc>
+          <w:tcPr>
+            <w:tcW w:type="dxa" w:w="2340"/>
+          </w:tcPr>
+          <w:p>
+            <w:r>
+              <w:t>Phân cụm Sản phẩm K-Means</w:t>
+            </w:r>
+          </w:p>
+        </w:tc>
+        <w:tc>
+          <w:tcPr>
+            <w:tcW w:type="dxa" w:w="2340"/>
+          </w:tcPr>
+          <w:p>
+            <w:r>
+              <w:t>K-Means Clustering (k=4)</w:t>
+            </w:r>
+          </w:p>
+        </w:tc>
+        <w:tc>
+          <w:tcPr>
+            <w:tcW w:type="dxa" w:w="2340"/>
+          </w:tcPr>
+          <w:p>
+            <w:r>
+              <w:t>4 cụm: Star, CashCow, Pot, Std</w:t>
+            </w:r>
+          </w:p>
+        </w:tc>
+        <w:tc>
+          <w:tcPr>
+            <w:tcW w:type="dxa" w:w="2340"/>
+          </w:tcPr>
+          <w:p>
+            <w:r>
+              <w:t>Tối ưu hóa danh mục lưu kho &amp; marketing</w:t>
             </w:r>
           </w:p>
         </w:tc>
@@ -342,90 +510,6 @@
           </w:p>
         </w:tc>
       </w:tr>
-      <w:tr>
-        <w:tc>
-          <w:tcPr>
-            <w:tcW w:type="dxa" w:w="2340"/>
-          </w:tcPr>
-          <w:p>
-            <w:r>
-              <w:t>Khai phá cảm xúc NLP</w:t>
-            </w:r>
-          </w:p>
-        </w:tc>
-        <w:tc>
-          <w:tcPr>
-            <w:tcW w:type="dxa" w:w="2340"/>
-          </w:tcPr>
-          <w:p>
-            <w:r>
-              <w:t>Vietnamese Aspect-based NLP</w:t>
-            </w:r>
-          </w:p>
-        </w:tc>
-        <w:tc>
-          <w:tcPr>
-            <w:tcW w:type="dxa" w:w="2340"/>
-          </w:tcPr>
-          <w:p>
-            <w:r>
-              <w:t>Độ chính xác &gt; 88%</w:t>
-            </w:r>
-          </w:p>
-        </w:tc>
-        <w:tc>
-          <w:tcPr>
-            <w:tcW w:type="dxa" w:w="2340"/>
-          </w:tcPr>
-          <w:p>
-            <w:r>
-              <w:t>Phát hiện điểm nghẽn đóng gói</w:t>
-            </w:r>
-          </w:p>
-        </w:tc>
-      </w:tr>
-      <w:tr>
-        <w:tc>
-          <w:tcPr>
-            <w:tcW w:type="dxa" w:w="2340"/>
-          </w:tcPr>
-          <w:p>
-            <w:r>
-              <w:t>Phân cụm khách hàng</w:t>
-            </w:r>
-          </w:p>
-        </w:tc>
-        <w:tc>
-          <w:tcPr>
-            <w:tcW w:type="dxa" w:w="2340"/>
-          </w:tcPr>
-          <w:p>
-            <w:r>
-              <w:t>RFM Score + K-Means (k=4)</w:t>
-            </w:r>
-          </w:p>
-        </w:tc>
-        <w:tc>
-          <w:tcPr>
-            <w:tcW w:type="dxa" w:w="2340"/>
-          </w:tcPr>
-          <w:p>
-            <w:r>
-              <w:t>4 phân khúc chuẩn</w:t>
-            </w:r>
-          </w:p>
-        </w:tc>
-        <w:tc>
-          <w:tcPr>
-            <w:tcW w:type="dxa" w:w="2340"/>
-          </w:tcPr>
-          <w:p>
-            <w:r>
-              <w:t>Tối ưu hóa ngân sách tiếp thị</w:t>
-            </w:r>
-          </w:p>
-        </w:tc>
-      </w:tr>
     </w:tbl>
     <w:p>
       <w:pPr>
@@ -440,7 +524,7 @@
         <w:spacing w:line="312" w:lineRule="auto"/>
       </w:pPr>
       <w:r>
-        <w:t>Nhóm đã hoàn thành xuất sắc toàn bộ các mục tiêu đề ra cho đồ án Công nghệ Dữ liệu lớn. Hệ thống hoạt động ổn định, có khả năng mở rộng quy mô (scale-out) trên cụm phân tán và giải quyết bài toán kinh doanh thực tế của Tiki. Hướng phát triển tiếp theo bao gồm tích hợp mô hình ngôn ngữ lớn PhoBERT để tinh chỉnh phân tích cảm xúc và tích hợp thanh toán tự động.</w:t>
+        <w:t>Nhóm đã hoàn thành xuất sắc toàn bộ các mục tiêu đề ra cho đồ án Công nghệ Dữ liệu lớn. Hệ thống hoạt động ổn định, có khả năng mở rộng quy mô (scale-out) trên cụm phân tán và giải quyết triệt để bài toán phân tích sản phẩm thực tế của sàn Tiki. Tập dữ liệu sản phẩm tiki_products_clean_full.csv và tài liệu kỹ thuật tra cứu API đi kèm cung cấp nền tảng vững chắc cho các bài toán mở rộng trong tương lai.</w:t>
       </w:r>
     </w:p>
     <w:sectPr>

</xml_diff>